<commit_message>
fix(spec): synchronize RC2 release artifacts
- remove resolved model-lock work and correct bundle wording\n- pin the artifact generation environment\n- verify packaged sources byte for byte
</commit_message>
<xml_diff>
--- a/spec/SVP_v1_0_RC2.docx
+++ b/spec/SVP_v1_0_RC2.docx
@@ -50426,7 +50426,6 @@
           <w:tab w:val="left" w:pos="709" w:leader="none"/>
         </w:tabs>
         <w:bidi w:val="0"/>
-        <w:spacing w:before="0" w:after="0"/>
         <w:ind w:hanging="283" w:start="709"/>
         <w:rPr/>
       </w:pPr>
@@ -50443,46 +50442,6 @@
       <w:r>
         <w:rPr/>
         <w:t xml:space="preserve"> distribution. </w:t>
-      </w:r>
-    </w:p>
-    <w:p>
-      <w:pPr>
-        <w:pStyle w:val="BodyText"/>
-        <w:numPr>
-          <w:ilvl w:val="0"/>
-          <w:numId w:val="38"/>
-        </w:numPr>
-        <w:tabs>
-          <w:tab w:val="clear" w:pos="1134"/>
-          <w:tab w:val="left" w:pos="709" w:leader="none"/>
-        </w:tabs>
-        <w:bidi w:val="0"/>
-        <w:ind w:hanging="283" w:start="709"/>
-        <w:rPr/>
-      </w:pPr>
-      <w:r>
-        <w:rPr/>
-        <w:t xml:space="preserve">Finalize the exact </w:t>
-      </w:r>
-      <w:r>
-        <w:rPr>
-          <w:rStyle w:val="SourceText"/>
-        </w:rPr>
-        <w:t>model-lock.json</w:t>
-      </w:r>
-      <w:r>
-        <w:rPr/>
-        <w:t xml:space="preserve"> schema and test disagreement handling against </w:t>
-      </w:r>
-      <w:r>
-        <w:rPr>
-          <w:rStyle w:val="SourceText"/>
-        </w:rPr>
-        <w:t>model.svpmodel.json</w:t>
-      </w:r>
-      <w:r>
-        <w:rPr/>
-        <w:t xml:space="preserve">. </w:t>
       </w:r>
     </w:p>
     <w:p>

</xml_diff>